<commit_message>
Fix ambiguous column headers in failure mode tables
Renamed 'T5Gemma Only' / 'Qwen Only' to 'T5Gemma Wins' / 'Qwen Wins'
to clarify these columns mean the model was the only one correct,
not the only one that failed.

https://claude.ai/code/session_011iji7txW5y1z47ZBJhqBU5
</commit_message>
<xml_diff>
--- a/projects/tabular-llms-research/experiments/encoder_vs_decoder_baseline/insights/20260401-imputation-list-deep-dive/synthesis.docx
+++ b/projects/tabular-llms-research/experiments/encoder_vs_decoder_baseline/insights/20260401-imputation-list-deep-dive/synthesis.docx
@@ -735,7 +735,7 @@
                 <w:color w:val="2B2B2B"/>
                 <w:sz w:val="20"/>
               </w:rPr>
-              <w:t>T5Gemma Only</w:t>
+              <w:t>T5Gemma Wins</w:t>
             </w:r>
           </w:p>
         </w:tc>
@@ -754,7 +754,7 @@
                 <w:color w:val="2B2B2B"/>
                 <w:sz w:val="20"/>
               </w:rPr>
-              <w:t>Qwen Only</w:t>
+              <w:t>Qwen Wins</w:t>
             </w:r>
           </w:p>
         </w:tc>
@@ -2921,7 +2921,7 @@
                 <w:color w:val="2B2B2B"/>
                 <w:sz w:val="20"/>
               </w:rPr>
-              <w:t>T5Gemma Only</w:t>
+              <w:t>T5Gemma Wins</w:t>
             </w:r>
           </w:p>
         </w:tc>
@@ -2940,7 +2940,7 @@
                 <w:color w:val="2B2B2B"/>
                 <w:sz w:val="20"/>
               </w:rPr>
-              <w:t>Qwen Only</w:t>
+              <w:t>Qwen Wins</w:t>
             </w:r>
           </w:p>
         </w:tc>

</xml_diff>